<commit_message>
docs: record 22 October iField source audit and manual amendment
Track #9; preserve production and engineering acceptance blockers.
</commit_message>
<xml_diff>
--- a/docs/manual/iSurvix_Field_Software_Manual.docx
+++ b/docs/manual/iSurvix_Field_Software_Manual.docx
@@ -57,23 +57,24 @@
         <w:pStyle w:val="Title"/>
       </w:pPr>
       <w:r>
-        <w:t>iSurvix Field Software Manual</w:t>
-      </w:r>
-    </w:p>
-    <w:p>
-      <w:r>
-        <w:t>Version 1.6</w:t>
-      </w:r>
-      <w:r>
-        <w:t xml:space="preserve">   •   </w:t>
-      </w:r>
-      <w:r>
-        <w:t>18 October 2026</w:t>
+        <w:rPr>
+          <w:color w:val="000000"/>
+          <w:u w:val="none"/>
+        </w:rPr>
+        <w:t>Isurvix iField Software Manual</w:t>
+      </w:r>
+    </w:p>
+    <w:p>
+      <w:r>
+        <w:t>Version 1.7   •   22 October 2026</w:t>
       </w:r>
     </w:p>
     <w:p>
       <w:r>
         <w:t>Use this manual to set up your company team, select the right project, complete inspections and move each activity through its required approvals. It explains the controls available to each role and how to use AI suggestions responsibly.</w:t>
+      </w:r>
+      <w:r>
+        <w:t xml:space="preserve"> Read the operational amendment on pages 18 and 19 before using later features.</w:t>
       </w:r>
     </w:p>
     <w:p>
@@ -3193,7 +3194,7 @@
               <w:rPr>
                 <w:sz w:val="18"/>
               </w:rPr>
-              <w:t>limit is 400 photos</w:t>
+              <w:t>limit is 500 photos</w:t>
             </w:r>
             <w:r>
               <w:rPr>
@@ -5063,12 +5064,12 @@
         <w:pStyle w:val="Heading2"/>
       </w:pPr>
       <w:r>
-        <w:t>Process up to 400 photos without rechecking unchanged images</w:t>
-      </w:r>
-    </w:p>
-    <w:p>
-      <w:r>
-        <w:t>A site can contain up to 400 photos. Choose Civil, Electrical or Tower, then Upload and analyze this group. Files are sent in batches of at most 20, with the displayed per-file size and image limits. Later groups can wait in the durable queue. The worker first extracts reusable photo metadata, then matches observations to checklist items. Valid cached observations can be reused; changed model or evidence requirements may require fresh analysis.</w:t>
+        <w:t>Process up to 500 photos without rechecking unchanged images</w:t>
+      </w:r>
+    </w:p>
+    <w:p>
+      <w:r>
+        <w:t>A site can contain up to 500 photos. Choose Civil, Electrical or Tower, then Upload and analyze this group. Files are sent in batches of at most 20, with the displayed per-file size and image limits. Later groups can wait in the durable queue. The worker first extracts reusable photo metadata, then matches observations to checklist items. Valid cached observations can be reused; changed model or evidence requirements may require fresh analysis.</w:t>
       </w:r>
     </w:p>
     <w:p>
@@ -5081,7 +5082,7 @@
     </w:p>
     <w:p>
       <w:r>
-        <w:t>Metadata ready and checklist matching are separate stages. Review unverified AI observations and source images, then confirm or correct suggested locations. Required photo gaps differ from recommended evidence gaps. An earlier failed attempt can remain in history after a later job completes its photos. Processing time depends on the computer, model and images; a 30 minute completion time for 400 photos is not guaranteed. The current installation is local to this computer; physical phone access and offline operation need separate setup and acceptance.</w:t>
+        <w:t>Metadata ready and checklist matching are separate stages. Review unverified AI observations and source images, then confirm or correct suggested locations. Required photo gaps differ from recommended evidence gaps. An earlier failed attempt can remain in history after a later job completes its photos. Processing time depends on the computer, model and images; a 30 minute completion time for 500 photos is not guaranteed. The current installation is local to this computer; physical phone access and offline operation need separate setup and acceptance.</w:t>
       </w:r>
     </w:p>
     <w:p>
@@ -5365,6 +5366,146 @@
       </w:r>
     </w:p>
     <w:p/>
+    <w:p>
+      <w:r>
+        <w:br w:type="page"/>
+      </w:r>
+    </w:p>
+    <w:p>
+      <w:pPr>
+        <w:pStyle w:val="Title"/>
+      </w:pPr>
+      <w:r>
+        <w:t>Operational amendment 22 October 2026</w:t>
+      </w:r>
+    </w:p>
+    <w:p>
+      <w:r>
+        <w:t>Isurvix-iField is the current product name. The repository and existing file paths retain iSurvix Field for continuity. This amendment describes audited development source b907601b8cac59cc111cb02f37489cc25073c866. It does not establish that this source is installed on your computer or a production server.</w:t>
+      </w:r>
+    </w:p>
+    <w:p>
+      <w:pPr>
+        <w:pStyle w:val="Heading2"/>
+      </w:pPr>
+      <w:r>
+        <w:t>Confirm the installed version</w:t>
+      </w:r>
+    </w:p>
+    <w:p>
+      <w:r>
+        <w:t>The source audit found main still at 2d9440c while later merged work is available on the development branch. Ask the release owner to confirm the installed source and current instructions. The historical static Sites sample is not the operational Django application. Do not use preview labels or a merged PR as proof that a feature is available.</w:t>
+      </w:r>
+    </w:p>
+    <w:p>
+      <w:pPr>
+        <w:pStyle w:val="Heading2"/>
+      </w:pPr>
+      <w:r>
+        <w:t>Use the current review chain</w:t>
+      </w:r>
+    </w:p>
+    <w:p>
+      <w:r>
+        <w:t>For new independent work, the assigned Engineer prepares L1, the assigned Quality Engineer performs L2, and the assigned Team Lead signs L3. A named Client supplies acceptance when required. These are separate people and decisions against the exact saved revision. Historical TL and Project Manager policies keep their recorded history. Administrators and AI do not replace signatures.</w:t>
+      </w:r>
+    </w:p>
+    <w:p>
+      <w:pPr>
+        <w:pStyle w:val="Heading2"/>
+      </w:pPr>
+      <w:r>
+        <w:t>Review survey processing and drawings</w:t>
+      </w:r>
+    </w:p>
+    <w:p>
+      <w:r>
+        <w:t>The later opt-in workflow accepts supported photos and source documents, freezes a revision, prepares proposed checklist records and draft vector PDF and editable DXF drawings. Review source references, missing information and measurements before accepting or applying a proposal. Recheck the current package after source changes. Keep Draft for review and Not to scale limitations until competent reviewers approve the applicable basis and exact deliverable.</w:t>
+      </w:r>
+    </w:p>
+    <w:p>
+      <w:r>
+        <w:t>The configured local limit is 500 photos per site. This is an intake limit, not a guaranteed processing time or accepted accuracy target. The earlier 400-photo timing estimate is historical. Full supported-site throughput, labelled accuracy, approved manufacturer and dimensional references, and real-device acceptance remain open.</w:t>
+      </w:r>
+    </w:p>
+    <w:p>
+      <w:pPr>
+        <w:pStyle w:val="Heading2"/>
+      </w:pPr>
+      <w:r>
+        <w:t>Check measurements and labels carefully</w:t>
+      </w:r>
+    </w:p>
+    <w:p>
+      <w:r>
+        <w:t>The 22 October audit found that unit symbols differing in case can be misinterpreted in proposed numeric records. Until corrected and independently verified, compare every value and original unit manually with the source. Do not rely on automatic conversion of MV, mV, MHz or mHz. Do not accept unsupported or ambiguous units. Drawing text can also replace Arabic and other non ASCII labels with question marks; verify exact Site ID, names and annotations in every exported file.</w:t>
+      </w:r>
+    </w:p>
+    <w:p>
+      <w:r>
+        <w:br w:type="page"/>
+      </w:r>
+    </w:p>
+    <w:p>
+      <w:pPr>
+        <w:pStyle w:val="Title"/>
+      </w:pPr>
+      <w:r>
+        <w:t>Recovery and release boundaries</w:t>
+      </w:r>
+    </w:p>
+    <w:p>
+      <w:pPr>
+        <w:pStyle w:val="Heading2"/>
+      </w:pPr>
+      <w:r>
+        <w:t>Interrupted uploads and processing</w:t>
+      </w:r>
+    </w:p>
+    <w:p>
+      <w:r>
+        <w:t>Keep the original evidence. Check the saved upload and processing state before retrying. Reuse completed source checkpoints where the application offers recovery; avoid creating duplicate submissions to make a progress indicator finish. Refresh stale pages before another action. A failed historical attempt may remain visible after a successful retry. Report missing or corrupt source files rather than replacing their history.</w:t>
+      </w:r>
+    </w:p>
+    <w:p>
+      <w:pPr>
+        <w:pStyle w:val="Heading2"/>
+      </w:pPr>
+      <w:r>
+        <w:t>Outbound worker setup</w:t>
+      </w:r>
+    </w:p>
+    <w:p>
+      <w:r>
+        <w:t>An authorized project administrator provisions a scoped worker token. The configured PC worker connects outbound to the approved server and runs the permitted local model. The worker is a proposal processor, not a reviewer or approver. Token expiry, revocation, source/model compatibility and job leases still apply. Follow docs/REMOTE_SURVEY_WORKER.md and the deployment operator’s approved instructions; do not expose local AI or private evidence publicly.</w:t>
+      </w:r>
+    </w:p>
+    <w:p>
+      <w:pPr>
+        <w:pStyle w:val="Heading2"/>
+      </w:pPr>
+      <w:r>
+        <w:t>Operate within accepted limits</w:t>
+      </w:r>
+    </w:p>
+    <w:p>
+      <w:r>
+        <w:t>Live VPS installation, TLS and private-file checks, recovery from real backups, physical-device usability and independent engineering acceptance remain unverified by this manual update. Do not claim production completion, a site pass, professional certification, a 500-photo service guarantee or an accepted design from passing source tests. Commercial, procurement, asset, maintenance, invoicing and payment modules remain roadmap work.</w:t>
+      </w:r>
+    </w:p>
+    <w:p>
+      <w:pPr>
+        <w:pStyle w:val="Heading2"/>
+      </w:pPr>
+      <w:r>
+        <w:t>Further instructions and audit record</w:t>
+      </w:r>
+    </w:p>
+    <w:p>
+      <w:r>
+        <w:t>Read docs/manual/AI_SURVEY_TEAM_GUIDE.md for the survey package, docs/manual/CHECKLIST_CREATION_GUIDE.md for template creation, docs/WORKFLOW_CRASH_RECOVERY.md for recovery, and docs/ROLES_AND_INVITATIONS.md for current authority. Preserve both legacy and independent Client rejection rules described in this manual. The dated report docs/audits/2026-10-22-ifield-scope-audit.md records satisfactory controls, open defects and required acceptance evidence. A documentation update does not close those findings.</w:t>
+      </w:r>
+    </w:p>
     <w:sectPr>
       <w:headerReference w:type="even" r:id="rId9"/>
       <w:headerReference w:type="default" r:id="rId10"/>
@@ -5427,7 +5568,7 @@
         <w:color w:val="617268"/>
         <w:sz w:val="16"/>
       </w:rPr>
-      <w:t>18 October 2026</w:t>
+      <w:t>22 October 2026</w:t>
     </w:r>
     <w:r>
       <w:rPr>
@@ -5441,7 +5582,7 @@
         <w:color w:val="617268"/>
         <w:sz w:val="16"/>
       </w:rPr>
-      <w:t>v1.6</w:t>
+      <w:t>v1.7</w:t>
     </w:r>
     <w:r>
       <w:rPr>
@@ -5524,7 +5665,7 @@
       <w:pStyle w:val="Caption"/>
     </w:pPr>
     <w:r>
-      <w:t>iSurvix Field   /   Software manual</w:t>
+      <w:t>Isurvix-iField   /   Software manual</w:t>
     </w:r>
   </w:p>
 </w:hdr>

</xml_diff>